<commit_message>
Tried some stuff in report.qmd
it didn't work
</commit_message>
<xml_diff>
--- a/report.docx
+++ b/report.docx
@@ -7,7 +7,7 @@
         <w:pStyle w:val="Title"/>
       </w:pPr>
       <w:r>
-        <w:t xml:space="preserve">Barbra and Lisa’s magical statistics adventure (working title)</w:t>
+        <w:t xml:space="preserve">Barbra and Lisa’s Magical Statistics Adventure (working title)</w:t>
       </w:r>
     </w:p>
     <w:p>
@@ -26,21 +26,70 @@
         <w:t xml:space="preserve">2026-03-16</w:t>
       </w:r>
     </w:p>
-    <w:bookmarkStart w:id="20" w:name="here-is-my-beautiful-data"/>
     <w:p>
       <w:pPr>
-        <w:pStyle w:val="Heading1"/>
-      </w:pPr>
-      <w:r>
-        <w:t xml:space="preserve">Here is my beautiful data!</w:t>
+        <w:pStyle w:val="FirstParagraph"/>
+      </w:pPr>
+      <w:r>
+        <w:t xml:space="preserve">#| label: setup</w:t>
+      </w:r>
+      <w:r>
+        <w:t xml:space="preserve"> </w:t>
+      </w:r>
+      <w:r>
+        <w:t xml:space="preserve">#| include: false</w:t>
+      </w:r>
+      <w:r>
+        <w:t xml:space="preserve"> </w:t>
+      </w:r>
+      <w:r>
+        <w:t xml:space="preserve">library(targets)</w:t>
+      </w:r>
+      <w:r>
+        <w:t xml:space="preserve"> </w:t>
+      </w:r>
+      <w:r>
+        <w:t xml:space="preserve">library(gtsummary)</w:t>
+      </w:r>
+      <w:r>
+        <w:t xml:space="preserve"> </w:t>
+      </w:r>
+      <w:r>
+        <w:t xml:space="preserve">library(ggplot2)</w:t>
       </w:r>
     </w:p>
     <w:p>
       <w:pPr>
-        <w:pStyle w:val="FirstParagraph"/>
-      </w:pPr>
-      <w:r>
-        <w:t xml:space="preserve">library(targets)</w:t>
+        <w:pStyle w:val="BodyText"/>
+      </w:pPr>
+      <w:r>
+        <w:t xml:space="preserve">#| label: summary-table</w:t>
+      </w:r>
+      <w:r>
+        <w:t xml:space="preserve"> </w:t>
+      </w:r>
+      <w:r>
+        <w:t xml:space="preserve">tar_read(pretty_summary)</w:t>
+      </w:r>
+    </w:p>
+    <w:p>
+      <w:pPr>
+        <w:pStyle w:val="BodyText"/>
+      </w:pPr>
+      <w:r>
+        <w:t xml:space="preserve">#| label: age-plot</w:t>
+      </w:r>
+      <w:r>
+        <w:t xml:space="preserve"> </w:t>
+      </w:r>
+      <w:r>
+        <w:t xml:space="preserve">#| fig-width: 10</w:t>
+      </w:r>
+      <w:r>
+        <w:t xml:space="preserve"> </w:t>
+      </w:r>
+      <w:r>
+        <w:t xml:space="preserve">#| fig-height: 6</w:t>
       </w:r>
       <w:r>
         <w:t xml:space="preserve"> </w:t>
@@ -49,7 +98,82 @@
         <w:t xml:space="preserve">tar_read(expense_age_plot)</w:t>
       </w:r>
     </w:p>
-    <w:bookmarkEnd w:id="20"/>
+    <w:p>
+      <w:pPr>
+        <w:pStyle w:val="BodyText"/>
+      </w:pPr>
+      <w:r>
+        <w:t xml:space="preserve">#| label: scatter-plot</w:t>
+      </w:r>
+      <w:r>
+        <w:t xml:space="preserve"> </w:t>
+      </w:r>
+      <w:r>
+        <w:t xml:space="preserve">#| fig-width: 10</w:t>
+      </w:r>
+      <w:r>
+        <w:t xml:space="preserve"> </w:t>
+      </w:r>
+      <w:r>
+        <w:t xml:space="preserve">#| fig-height: 6</w:t>
+      </w:r>
+      <w:r>
+        <w:t xml:space="preserve"> </w:t>
+      </w:r>
+      <w:r>
+        <w:t xml:space="preserve">tar_read(combined_trend_plot)</w:t>
+      </w:r>
+    </w:p>
+    <w:p>
+      <w:pPr>
+        <w:pStyle w:val="BodyText"/>
+      </w:pPr>
+      <w:r>
+        <w:t xml:space="preserve">#| label: regression-output</w:t>
+      </w:r>
+      <w:r>
+        <w:t xml:space="preserve"> </w:t>
+      </w:r>
+      <w:r>
+        <w:t xml:space="preserve"># Since regression_results is a raw</w:t>
+      </w:r>
+      <w:r>
+        <w:t xml:space="preserve"> </w:t>
+      </w:r>
+      <w:r>
+        <w:t xml:space="preserve">‘lm’</w:t>
+      </w:r>
+      <w:r>
+        <w:t xml:space="preserve"> </w:t>
+      </w:r>
+      <w:r>
+        <w:t xml:space="preserve">object,</w:t>
+      </w:r>
+      <w:r>
+        <w:t xml:space="preserve"> </w:t>
+      </w:r>
+      <w:r>
+        <w:t xml:space="preserve"># we use tbl_regression to make it look pretty like the rest!</w:t>
+      </w:r>
+      <w:r>
+        <w:t xml:space="preserve"> </w:t>
+      </w:r>
+      <w:r>
+        <w:t xml:space="preserve">library(gtsummary)</w:t>
+      </w:r>
+      <w:r>
+        <w:t xml:space="preserve"> </w:t>
+      </w:r>
+      <w:r>
+        <w:t xml:space="preserve">tar_read(regression_results) |&gt;</w:t>
+      </w:r>
+      <w:r>
+        <w:t xml:space="preserve"> </w:t>
+      </w:r>
+      <w:r>
+        <w:t xml:space="preserve">tbl_regression()</w:t>
+      </w:r>
+    </w:p>
     <w:sectPr>
       <w:footnotePr>
         <w:numRestart w:val="eachSect"/>

</xml_diff>

<commit_message>
Slides make all pretty it's so good we are so proud yay!!! (we did everything today together!)
</commit_message>
<xml_diff>
--- a/report.docx
+++ b/report.docx
@@ -7,7 +7,7 @@
         <w:pStyle w:val="Title"/>
       </w:pPr>
       <w:r>
-        <w:t xml:space="preserve">Barbra and Lisa’s Magical Statistics Adventure (working title)</w:t>
+        <w:t xml:space="preserve">Our Magical Statistics Adventure</w:t>
       </w:r>
     </w:p>
     <w:p>
@@ -26,13 +26,84 @@
         <w:t xml:space="preserve">2026-03-16</w:t>
       </w:r>
     </w:p>
-    <w:bookmarkStart w:id="20" w:name="section"/>
+    <w:bookmarkStart w:id="20" w:name="our-research-questions"/>
     <w:p>
       <w:pPr>
         <w:pStyle w:val="Heading2"/>
       </w:pPr>
       <w:r>
-        <w:t xml:space="preserve">2</w:t>
+        <w:t xml:space="preserve">Our research questions</w:t>
+      </w:r>
+    </w:p>
+    <w:p>
+      <w:pPr>
+        <w:pStyle w:val="FirstParagraph"/>
+      </w:pPr>
+      <w:r>
+        <w:t xml:space="preserve">Our research topic:</w:t>
+      </w:r>
+    </w:p>
+    <w:p>
+      <w:pPr>
+        <w:pStyle w:val="BodyText"/>
+      </w:pPr>
+      <w:r>
+        <w:rPr>
+          <w:b/>
+          <w:bCs/>
+        </w:rPr>
+        <w:t xml:space="preserve">How do Age, Gender, and Healthcare Encounters relate to Medical Expenses?</w:t>
+      </w:r>
+    </w:p>
+    <w:p>
+      <w:pPr>
+        <w:pStyle w:val="BodyText"/>
+      </w:pPr>
+      <w:r>
+        <w:t xml:space="preserve">Our sub-topics:</w:t>
+      </w:r>
+    </w:p>
+    <w:p>
+      <w:pPr>
+        <w:numPr>
+          <w:ilvl w:val="0"/>
+          <w:numId w:val="1001"/>
+        </w:numPr>
+      </w:pPr>
+      <w:r>
+        <w:t xml:space="preserve">How do healthcare expenses vary across age groups?</w:t>
+      </w:r>
+    </w:p>
+    <w:p>
+      <w:pPr>
+        <w:numPr>
+          <w:ilvl w:val="0"/>
+          <w:numId w:val="1001"/>
+        </w:numPr>
+      </w:pPr>
+      <w:r>
+        <w:t xml:space="preserve">Are there differences in healthcare expenses between male and female patients?</w:t>
+      </w:r>
+    </w:p>
+    <w:p>
+      <w:pPr>
+        <w:numPr>
+          <w:ilvl w:val="0"/>
+          <w:numId w:val="1001"/>
+        </w:numPr>
+      </w:pPr>
+      <w:r>
+        <w:t xml:space="preserve">Is the number of healthcare encounters associated with healthcare expenses across genders?</w:t>
+      </w:r>
+    </w:p>
+    <w:bookmarkEnd w:id="20"/>
+    <w:bookmarkStart w:id="21" w:name="descriptive-statistics"/>
+    <w:p>
+      <w:pPr>
+        <w:pStyle w:val="Heading2"/>
+      </w:pPr>
+      <w:r>
+        <w:t xml:space="preserve">Descriptive Statistics</w:t>
       </w:r>
     </w:p>
     <w:tbl xmlns:w="http://schemas.openxmlformats.org/wordprocessingml/2006/main" xmlns:wp="http://schemas.openxmlformats.org/drawingml/2006/wordprocessingDrawing" xmlns:r="http://schemas.openxmlformats.org/officeDocument/2006/relationships" xmlns:w14="http://schemas.microsoft.com/office/word/2010/wordml">
@@ -709,14 +780,58 @@
         </w:tc>
       </w:tr>
     </w:tbl>
-    <w:bookmarkEnd w:id="20"/>
-    <w:bookmarkStart w:id="24" w:name="section-1"/>
+    <w:p>
+      <w:pPr>
+        <w:numPr>
+          <w:ilvl w:val="0"/>
+          <w:numId w:val="1002"/>
+        </w:numPr>
+      </w:pPr>
+      <w:r>
+        <w:t xml:space="preserve">Approximately equal number of males and females</w:t>
+      </w:r>
+    </w:p>
+    <w:p>
+      <w:pPr>
+        <w:numPr>
+          <w:ilvl w:val="0"/>
+          <w:numId w:val="1002"/>
+        </w:numPr>
+      </w:pPr>
+      <w:r>
+        <w:t xml:space="preserve">Age is balanced between genders</w:t>
+      </w:r>
+    </w:p>
+    <w:p>
+      <w:pPr>
+        <w:numPr>
+          <w:ilvl w:val="0"/>
+          <w:numId w:val="1002"/>
+        </w:numPr>
+      </w:pPr>
+      <w:r>
+        <w:t xml:space="preserve">Encounters for women are higher</w:t>
+      </w:r>
+    </w:p>
+    <w:p>
+      <w:pPr>
+        <w:numPr>
+          <w:ilvl w:val="0"/>
+          <w:numId w:val="1002"/>
+        </w:numPr>
+      </w:pPr>
+      <w:r>
+        <w:t xml:space="preserve">Medical expenses for women are higher</w:t>
+      </w:r>
+    </w:p>
+    <w:bookmarkEnd w:id="21"/>
+    <w:bookmarkStart w:id="25" w:name="histogram-of-expenses-by-age-and-gender"/>
     <w:p>
       <w:pPr>
         <w:pStyle w:val="Heading2"/>
       </w:pPr>
       <w:r>
-        <w:t xml:space="preserve">3</w:t>
+        <w:t xml:space="preserve">Histogram of Expenses by Age and Gender</w:t>
       </w:r>
     </w:p>
     <w:p>
@@ -728,18 +843,18 @@
           <wp:inline>
             <wp:extent cx="5334000" cy="3200400"/>
             <wp:effectExtent b="0" l="0" r="0" t="0"/>
-            <wp:docPr descr="" title="" id="22" name="Picture"/>
+            <wp:docPr descr="" title="" id="23" name="Picture"/>
             <a:graphic>
               <a:graphicData uri="http://schemas.openxmlformats.org/drawingml/2006/picture">
                 <pic:pic>
                   <pic:nvPicPr>
-                    <pic:cNvPr descr="report_files/figure-docx/age-plot-1.png" id="23" name="Picture"/>
+                    <pic:cNvPr descr="report_files/figure-docx/age-plot-1.png" id="24" name="Picture"/>
                     <pic:cNvPicPr>
                       <a:picLocks noChangeArrowheads="1" noChangeAspect="1"/>
                     </pic:cNvPicPr>
                   </pic:nvPicPr>
                   <pic:blipFill>
-                    <a:blip r:embed="rId21"/>
+                    <a:blip r:embed="rId22"/>
                     <a:stretch>
                       <a:fillRect/>
                     </a:stretch>
@@ -766,14 +881,36 @@
         </w:drawing>
       </w:r>
     </w:p>
-    <w:bookmarkEnd w:id="24"/>
-    <w:bookmarkStart w:id="28" w:name="section-2"/>
+    <w:p>
+      <w:pPr>
+        <w:numPr>
+          <w:ilvl w:val="0"/>
+          <w:numId w:val="1003"/>
+        </w:numPr>
+      </w:pPr>
+      <w:r>
+        <w:t xml:space="preserve">Even though age and gender were evenly distributed, expenses for women are clearly higher.</w:t>
+      </w:r>
+    </w:p>
+    <w:p>
+      <w:pPr>
+        <w:numPr>
+          <w:ilvl w:val="0"/>
+          <w:numId w:val="1003"/>
+        </w:numPr>
+      </w:pPr>
+      <w:r>
+        <w:t xml:space="preserve">As age increases, so do expenses for both genders.</w:t>
+      </w:r>
+    </w:p>
+    <w:bookmarkEnd w:id="25"/>
+    <w:bookmarkStart w:id="29" w:name="X65e1a8e7d6e157b510cf73122863ce19cb58edd"/>
     <w:p>
       <w:pPr>
         <w:pStyle w:val="Heading2"/>
       </w:pPr>
       <w:r>
-        <w:t xml:space="preserve">4</w:t>
+        <w:t xml:space="preserve">Scatterplot of Encounters to Expenses Compared Between Genders</w:t>
       </w:r>
     </w:p>
     <w:p>
@@ -805,18 +942,18 @@
           <wp:inline>
             <wp:extent cx="5334000" cy="3200400"/>
             <wp:effectExtent b="0" l="0" r="0" t="0"/>
-            <wp:docPr descr="" title="" id="26" name="Picture"/>
+            <wp:docPr descr="" title="" id="27" name="Picture"/>
             <a:graphic>
               <a:graphicData uri="http://schemas.openxmlformats.org/drawingml/2006/picture">
                 <pic:pic>
                   <pic:nvPicPr>
-                    <pic:cNvPr descr="report_files/figure-docx/scatter-plot-1.png" id="27" name="Picture"/>
+                    <pic:cNvPr descr="report_files/figure-docx/scatter-plot-1.png" id="28" name="Picture"/>
                     <pic:cNvPicPr>
                       <a:picLocks noChangeArrowheads="1" noChangeAspect="1"/>
                     </pic:cNvPicPr>
                   </pic:nvPicPr>
                   <pic:blipFill>
-                    <a:blip r:embed="rId25"/>
+                    <a:blip r:embed="rId26"/>
                     <a:stretch>
                       <a:fillRect/>
                     </a:stretch>
@@ -843,14 +980,36 @@
         </w:drawing>
       </w:r>
     </w:p>
-    <w:bookmarkEnd w:id="28"/>
-    <w:bookmarkStart w:id="29" w:name="section-3"/>
+    <w:p>
+      <w:pPr>
+        <w:numPr>
+          <w:ilvl w:val="0"/>
+          <w:numId w:val="1004"/>
+        </w:numPr>
+      </w:pPr>
+      <w:r>
+        <w:t xml:space="preserve">Both genders have increased cost for increased encounters.</w:t>
+      </w:r>
+    </w:p>
+    <w:p>
+      <w:pPr>
+        <w:numPr>
+          <w:ilvl w:val="0"/>
+          <w:numId w:val="1004"/>
+        </w:numPr>
+      </w:pPr>
+      <w:r>
+        <w:t xml:space="preserve">The increase is steeper for women than men.</w:t>
+      </w:r>
+    </w:p>
+    <w:bookmarkEnd w:id="29"/>
+    <w:bookmarkStart w:id="30" w:name="linear-regression"/>
     <w:p>
       <w:pPr>
         <w:pStyle w:val="Heading2"/>
       </w:pPr>
       <w:r>
-        <w:t xml:space="preserve">5</w:t>
+        <w:t xml:space="preserve">Linear Regression</w:t>
       </w:r>
     </w:p>
     <w:p>
@@ -1687,7 +1846,77 @@
         </w:tc>
       </w:tr>
     </w:tbl>
-    <w:bookmarkEnd w:id="29"/>
+    <w:p>
+      <w:pPr>
+        <w:pStyle w:val="FirstParagraph"/>
+      </w:pPr>
+      <w:r>
+        <w:t xml:space="preserve">healthcare_expenses ~ age + gender + n_encounters + age*n_encounters</w:t>
+      </w:r>
+    </w:p>
+    <w:p>
+      <w:pPr>
+        <w:numPr>
+          <w:ilvl w:val="0"/>
+          <w:numId w:val="1005"/>
+        </w:numPr>
+      </w:pPr>
+      <w:r>
+        <w:t xml:space="preserve">Increasing age leads to increasing expenses</w:t>
+      </w:r>
+    </w:p>
+    <w:p>
+      <w:pPr>
+        <w:numPr>
+          <w:ilvl w:val="0"/>
+          <w:numId w:val="1005"/>
+        </w:numPr>
+      </w:pPr>
+      <w:r>
+        <w:t xml:space="preserve">Being male decreases expenses</w:t>
+      </w:r>
+    </w:p>
+    <w:p>
+      <w:pPr>
+        <w:numPr>
+          <w:ilvl w:val="0"/>
+          <w:numId w:val="1005"/>
+        </w:numPr>
+      </w:pPr>
+      <w:r>
+        <w:t xml:space="preserve">Increasing encounters increases expenses</w:t>
+      </w:r>
+    </w:p>
+    <w:p>
+      <w:pPr>
+        <w:numPr>
+          <w:ilvl w:val="0"/>
+          <w:numId w:val="1005"/>
+        </w:numPr>
+      </w:pPr>
+      <w:r>
+        <w:t xml:space="preserve">Interaction term barely affects slope</w:t>
+      </w:r>
+    </w:p>
+    <w:p>
+      <w:pPr>
+        <w:pStyle w:val="FirstParagraph"/>
+      </w:pPr>
+      <w:r>
+        <w:t xml:space="preserve">All are significant</w:t>
+      </w:r>
+    </w:p>
+    <w:bookmarkEnd w:id="30"/>
+    <w:bookmarkStart w:id="31" w:name="thank-you"/>
+    <w:p>
+      <w:pPr>
+        <w:pStyle w:val="Heading2"/>
+      </w:pPr>
+      <w:r>
+        <w:t xml:space="preserve">Thank you! 💖</w:t>
+      </w:r>
+    </w:p>
+    <w:bookmarkEnd w:id="31"/>
     <w:sectPr>
       <w:footnotePr>
         <w:numRestart w:val="eachSect"/>
@@ -1798,8 +2027,126 @@
       </w:pPr>
     </w:lvl>
   </w:abstractNum>
+  <w:abstractNum w:abstractNumId="991">
+    <w:nsid w:val="0000A991"/>
+    <w:multiLevelType w:val="multilevel"/>
+    <w:lvl w:ilvl="0">
+      <w:numFmt w:val="bullet"/>
+      <w:lvlText w:val=""/>
+      <w:lvlJc w:val="left"/>
+      <w:pPr>
+        <w:ind w:left="720" w:hanging="360"/>
+      </w:pPr>
+      <w:rPr>
+        <w:rFonts w:ascii="Symbol" w:hAnsi="Symbol" w:cs="Symbol" w:hint="default"/>
+      </w:rPr>
+    </w:lvl>
+    <w:lvl w:ilvl="1">
+      <w:numFmt w:val="bullet"/>
+      <w:lvlText w:val="o"/>
+      <w:lvlJc w:val="left"/>
+      <w:pPr>
+        <w:ind w:left="1440" w:hanging="360"/>
+      </w:pPr>
+      <w:rPr>
+        <w:rFonts w:ascii="Courier New" w:hAnsi="Courier New" w:cs="Courier New" w:hint="default"/>
+      </w:rPr>
+    </w:lvl>
+    <w:lvl w:ilvl="2">
+      <w:numFmt w:val="bullet"/>
+      <w:lvlText w:val=""/>
+      <w:lvlJc w:val="left"/>
+      <w:pPr>
+        <w:ind w:left="2160" w:hanging="360"/>
+      </w:pPr>
+      <w:rPr>
+        <w:rFonts w:ascii="Wingdings" w:hAnsi="Wingdings" w:cs="Wingdings" w:hint="default"/>
+      </w:rPr>
+    </w:lvl>
+    <w:lvl w:ilvl="3">
+      <w:numFmt w:val="bullet"/>
+      <w:lvlText w:val=""/>
+      <w:lvlJc w:val="left"/>
+      <w:pPr>
+        <w:ind w:left="2880" w:hanging="360"/>
+      </w:pPr>
+      <w:rPr>
+        <w:rFonts w:ascii="Symbol" w:hAnsi="Symbol" w:cs="Symbol" w:hint="default"/>
+      </w:rPr>
+    </w:lvl>
+    <w:lvl w:ilvl="4">
+      <w:numFmt w:val="bullet"/>
+      <w:lvlText w:val="o"/>
+      <w:lvlJc w:val="left"/>
+      <w:pPr>
+        <w:ind w:left="3600" w:hanging="360"/>
+      </w:pPr>
+      <w:rPr>
+        <w:rFonts w:ascii="Courier New" w:hAnsi="Courier New" w:cs="Courier New" w:hint="default"/>
+      </w:rPr>
+    </w:lvl>
+    <w:lvl w:ilvl="5">
+      <w:numFmt w:val="bullet"/>
+      <w:lvlText w:val=""/>
+      <w:lvlJc w:val="left"/>
+      <w:pPr>
+        <w:ind w:left="4320" w:hanging="360"/>
+      </w:pPr>
+      <w:rPr>
+        <w:rFonts w:ascii="Wingdings" w:hAnsi="Wingdings" w:cs="Wingdings" w:hint="default"/>
+      </w:rPr>
+    </w:lvl>
+    <w:lvl w:ilvl="6">
+      <w:numFmt w:val="bullet"/>
+      <w:lvlText w:val=""/>
+      <w:lvlJc w:val="left"/>
+      <w:pPr>
+        <w:ind w:left="5040" w:hanging="360"/>
+      </w:pPr>
+      <w:rPr>
+        <w:rFonts w:ascii="Symbol" w:hAnsi="Symbol" w:cs="Symbol" w:hint="default"/>
+      </w:rPr>
+    </w:lvl>
+    <w:lvl w:ilvl="7">
+      <w:numFmt w:val="bullet"/>
+      <w:lvlText w:val="o"/>
+      <w:lvlJc w:val="left"/>
+      <w:pPr>
+        <w:ind w:left="5760" w:hanging="360"/>
+      </w:pPr>
+      <w:rPr>
+        <w:rFonts w:ascii="Courier New" w:hAnsi="Courier New" w:cs="Courier New" w:hint="default"/>
+      </w:rPr>
+    </w:lvl>
+    <w:lvl w:ilvl="8">
+      <w:numFmt w:val="bullet"/>
+      <w:lvlText w:val=""/>
+      <w:lvlJc w:val="left"/>
+      <w:pPr>
+        <w:ind w:left="6480" w:hanging="360"/>
+      </w:pPr>
+      <w:rPr>
+        <w:rFonts w:ascii="Wingdings" w:hAnsi="Wingdings" w:cs="Wingdings" w:hint="default"/>
+      </w:rPr>
+    </w:lvl>
+  </w:abstractNum>
   <w:num w:numId="1000">
     <w:abstractNumId w:val="990"/>
+  </w:num>
+  <w:num w:numId="1001">
+    <w:abstractNumId w:val="991"/>
+  </w:num>
+  <w:num w:numId="1002">
+    <w:abstractNumId w:val="991"/>
+  </w:num>
+  <w:num w:numId="1003">
+    <w:abstractNumId w:val="991"/>
+  </w:num>
+  <w:num w:numId="1004">
+    <w:abstractNumId w:val="991"/>
+  </w:num>
+  <w:num w:numId="1005">
+    <w:abstractNumId w:val="991"/>
   </w:num>
 </w:numbering>
 </file>

</xml_diff>

<commit_message>
Aesthetics enhancement and fitting a log transformed model because because healthcare expenses were highly skewed
</commit_message>
<xml_diff>
--- a/report.docx
+++ b/report.docx
@@ -23,16 +23,16 @@
         <w:pStyle w:val="Date"/>
       </w:pPr>
       <w:r>
-        <w:t xml:space="preserve">2026-03-16</w:t>
-      </w:r>
-    </w:p>
-    <w:bookmarkStart w:id="20" w:name="our-research-questions"/>
+        <w:t xml:space="preserve">2026-03-17</w:t>
+      </w:r>
+    </w:p>
+    <w:bookmarkStart w:id="20" w:name="research-question"/>
     <w:p>
       <w:pPr>
         <w:pStyle w:val="Heading2"/>
       </w:pPr>
       <w:r>
-        <w:t xml:space="preserve">Our research questions</w:t>
+        <w:t xml:space="preserve">Research Question</w:t>
       </w:r>
     </w:p>
     <w:p>
@@ -40,7 +40,15 @@
         <w:pStyle w:val="FirstParagraph"/>
       </w:pPr>
       <w:r>
-        <w:t xml:space="preserve">Our research topic:</w:t>
+        <w:t xml:space="preserve">We examine how healthcare expenses are associated with patient age, gender, and healthcare utilization, measured as the number of encounters.</w:t>
+      </w:r>
+    </w:p>
+    <w:p>
+      <w:pPr>
+        <w:pStyle w:val="BodyText"/>
+      </w:pPr>
+      <w:r>
+        <w:t xml:space="preserve">Our main research question is:</w:t>
       </w:r>
     </w:p>
     <w:p>
@@ -52,7 +60,7 @@
           <w:b/>
           <w:bCs/>
         </w:rPr>
-        <w:t xml:space="preserve">How do Age, Gender, and Healthcare Encounters relate to Medical Expenses?</w:t>
+        <w:t xml:space="preserve">How are healthcare expenses associated with age, gender, and healthcare utilization (number of encounters)?</w:t>
       </w:r>
     </w:p>
     <w:p>
@@ -60,11 +68,12 @@
         <w:pStyle w:val="BodyText"/>
       </w:pPr>
       <w:r>
-        <w:t xml:space="preserve">Our sub-topics:</w:t>
-      </w:r>
-    </w:p>
-    <w:p>
-      <w:pPr>
+        <w:t xml:space="preserve">We also explore three related sub-questions:</w:t>
+      </w:r>
+    </w:p>
+    <w:p>
+      <w:pPr>
+        <w:pStyle w:val="Compact"/>
         <w:numPr>
           <w:ilvl w:val="0"/>
           <w:numId w:val="1001"/>
@@ -76,6 +85,7 @@
     </w:p>
     <w:p>
       <w:pPr>
+        <w:pStyle w:val="Compact"/>
         <w:numPr>
           <w:ilvl w:val="0"/>
           <w:numId w:val="1001"/>
@@ -87,6 +97,7 @@
     </w:p>
     <w:p>
       <w:pPr>
+        <w:pStyle w:val="Compact"/>
         <w:numPr>
           <w:ilvl w:val="0"/>
           <w:numId w:val="1001"/>
@@ -825,13 +836,13 @@
       </w:r>
     </w:p>
     <w:bookmarkEnd w:id="21"/>
-    <w:bookmarkStart w:id="25" w:name="histogram-of-expenses-by-age-and-gender"/>
+    <w:bookmarkStart w:id="25" w:name="barchart-of-expenses-by-age-and-gender"/>
     <w:p>
       <w:pPr>
         <w:pStyle w:val="Heading2"/>
       </w:pPr>
       <w:r>
-        <w:t xml:space="preserve">Histogram of Expenses by Age and Gender</w:t>
+        <w:t xml:space="preserve">Barchart of Expenses by Age and Gender</w:t>
       </w:r>
     </w:p>
     <w:p>
@@ -1264,31 +1275,31 @@
                 <w:rFonts w:ascii="Calibri" w:hAnsi="Calibri"/>
                 <w:sz w:val="20"/>
               </w:rPr>
-              <w:t xml:space="default">4,743</w:t>
-            </w:r>
-          </w:p>
-        </w:tc>
-        <w:tc>
-          <w:tcPr>
-            <w:tcBorders>
-              <w:top w:val="single" w:space="0" w:color="D3D3D3"/>
-              <w:bottom w:val="single" w:space="0" w:color="D3D3D3"/>
-              <w:start w:val="single" w:space="0" w:color="D3D3D3"/>
-              <w:end w:val="single" w:space="0" w:color="D3D3D3"/>
-            </w:tcBorders>
-          </w:tcPr>
-          <w:p>
-            <w:pPr>
-              <w:spacing w:before="0" w:after="60"/>
-              <w:keepNext/>
-              <w:jc w:val="center"/>
-            </w:pPr>
-            <w:r>
-              <w:rPr>
-                <w:rFonts w:ascii="Calibri" w:hAnsi="Calibri"/>
-                <w:sz w:val="20"/>
-              </w:rPr>
-              <w:t xml:space="default">4,410, 5,076</w:t>
+              <w:t xml:space="default">0.04</w:t>
+            </w:r>
+          </w:p>
+        </w:tc>
+        <w:tc>
+          <w:tcPr>
+            <w:tcBorders>
+              <w:top w:val="single" w:space="0" w:color="D3D3D3"/>
+              <w:bottom w:val="single" w:space="0" w:color="D3D3D3"/>
+              <w:start w:val="single" w:space="0" w:color="D3D3D3"/>
+              <w:end w:val="single" w:space="0" w:color="D3D3D3"/>
+            </w:tcBorders>
+          </w:tcPr>
+          <w:p>
+            <w:pPr>
+              <w:spacing w:before="0" w:after="60"/>
+              <w:keepNext/>
+              <w:jc w:val="center"/>
+            </w:pPr>
+            <w:r>
+              <w:rPr>
+                <w:rFonts w:ascii="Calibri" w:hAnsi="Calibri"/>
+                <w:sz w:val="20"/>
+              </w:rPr>
+              <w:t xml:space="default">0.04, 0.04</w:t>
             </w:r>
           </w:p>
         </w:tc>
@@ -1567,31 +1578,31 @@
                 <w:rFonts w:ascii="Calibri" w:hAnsi="Calibri"/>
                 <w:sz w:val="20"/>
               </w:rPr>
-              <w:t xml:space="default">-171,370</w:t>
-            </w:r>
-          </w:p>
-        </w:tc>
-        <w:tc>
-          <w:tcPr>
-            <w:tcBorders>
-              <w:top w:val="single" w:space="0" w:color="D3D3D3"/>
-              <w:bottom w:val="single" w:space="0" w:color="D3D3D3"/>
-              <w:start w:val="single" w:space="0" w:color="D3D3D3"/>
-              <w:end w:val="single" w:space="0" w:color="D3D3D3"/>
-            </w:tcBorders>
-          </w:tcPr>
-          <w:p>
-            <w:pPr>
-              <w:spacing w:before="0" w:after="60"/>
-              <w:keepNext/>
-              <w:jc w:val="center"/>
-            </w:pPr>
-            <w:r>
-              <w:rPr>
-                <w:rFonts w:ascii="Calibri" w:hAnsi="Calibri"/>
-                <w:sz w:val="20"/>
-              </w:rPr>
-              <w:t xml:space="default">-185,382, -157,358</w:t>
+              <w:t xml:space="default">-0.60</w:t>
+            </w:r>
+          </w:p>
+        </w:tc>
+        <w:tc>
+          <w:tcPr>
+            <w:tcBorders>
+              <w:top w:val="single" w:space="0" w:color="D3D3D3"/>
+              <w:bottom w:val="single" w:space="0" w:color="D3D3D3"/>
+              <w:start w:val="single" w:space="0" w:color="D3D3D3"/>
+              <w:end w:val="single" w:space="0" w:color="D3D3D3"/>
+            </w:tcBorders>
+          </w:tcPr>
+          <w:p>
+            <w:pPr>
+              <w:spacing w:before="0" w:after="60"/>
+              <w:keepNext/>
+              <w:jc w:val="center"/>
+            </w:pPr>
+            <w:r>
+              <w:rPr>
+                <w:rFonts w:ascii="Calibri" w:hAnsi="Calibri"/>
+                <w:sz w:val="20"/>
+              </w:rPr>
+              <w:t xml:space="default">-0.67, -0.54</w:t>
             </w:r>
           </w:p>
         </w:tc>
@@ -1668,31 +1679,31 @@
                 <w:rFonts w:ascii="Calibri" w:hAnsi="Calibri"/>
                 <w:sz w:val="20"/>
               </w:rPr>
-              <w:t xml:space="default">1,357</w:t>
-            </w:r>
-          </w:p>
-        </w:tc>
-        <w:tc>
-          <w:tcPr>
-            <w:tcBorders>
-              <w:top w:val="single" w:space="0" w:color="D3D3D3"/>
-              <w:bottom w:val="single" w:space="0" w:color="D3D3D3"/>
-              <w:start w:val="single" w:space="0" w:color="D3D3D3"/>
-              <w:end w:val="single" w:space="0" w:color="D3D3D3"/>
-            </w:tcBorders>
-          </w:tcPr>
-          <w:p>
-            <w:pPr>
-              <w:spacing w:before="0" w:after="60"/>
-              <w:keepNext/>
-              <w:jc w:val="center"/>
-            </w:pPr>
-            <w:r>
-              <w:rPr>
-                <w:rFonts w:ascii="Calibri" w:hAnsi="Calibri"/>
-                <w:sz w:val="20"/>
-              </w:rPr>
-              <w:t xml:space="default">1,203, 1,510</w:t>
+              <w:t xml:space="default">0.00</w:t>
+            </w:r>
+          </w:p>
+        </w:tc>
+        <w:tc>
+          <w:tcPr>
+            <w:tcBorders>
+              <w:top w:val="single" w:space="0" w:color="D3D3D3"/>
+              <w:bottom w:val="single" w:space="0" w:color="D3D3D3"/>
+              <w:start w:val="single" w:space="0" w:color="D3D3D3"/>
+              <w:end w:val="single" w:space="0" w:color="D3D3D3"/>
+            </w:tcBorders>
+          </w:tcPr>
+          <w:p>
+            <w:pPr>
+              <w:spacing w:before="0" w:after="60"/>
+              <w:keepNext/>
+              <w:jc w:val="center"/>
+            </w:pPr>
+            <w:r>
+              <w:rPr>
+                <w:rFonts w:ascii="Calibri" w:hAnsi="Calibri"/>
+                <w:sz w:val="20"/>
+              </w:rPr>
+              <w:t xml:space="default">0.00, 0.00</w:t>
             </w:r>
           </w:p>
         </w:tc>
@@ -1727,107 +1738,6 @@
         </w:trPr>
         <w:tc>
           <w:tcPr>
-            <w:tcBorders>
-              <w:top w:val="single" w:space="0" w:color="D3D3D3"/>
-              <w:bottom w:val="single" w:space="0" w:color="D3D3D3"/>
-              <w:start w:val="single" w:space="0" w:color="D3D3D3"/>
-              <w:end w:val="single" w:space="0" w:color="D3D3D3"/>
-            </w:tcBorders>
-          </w:tcPr>
-          <w:p>
-            <w:pPr>
-              <w:spacing w:before="0" w:after="60"/>
-              <w:keepNext/>
-              <w:jc w:val="start"/>
-            </w:pPr>
-            <w:r>
-              <w:rPr>
-                <w:rFonts w:ascii="Calibri" w:hAnsi="Calibri"/>
-                <w:sz w:val="20"/>
-              </w:rPr>
-              <w:t xml:space="default">age * n_encounters</w:t>
-            </w:r>
-          </w:p>
-        </w:tc>
-        <w:tc>
-          <w:tcPr>
-            <w:tcBorders>
-              <w:top w:val="single" w:space="0" w:color="D3D3D3"/>
-              <w:bottom w:val="single" w:space="0" w:color="D3D3D3"/>
-              <w:start w:val="single" w:space="0" w:color="D3D3D3"/>
-              <w:end w:val="single" w:space="0" w:color="D3D3D3"/>
-            </w:tcBorders>
-          </w:tcPr>
-          <w:p>
-            <w:pPr>
-              <w:spacing w:before="0" w:after="60"/>
-              <w:keepNext/>
-              <w:jc w:val="center"/>
-            </w:pPr>
-            <w:r>
-              <w:rPr>
-                <w:rFonts w:ascii="Calibri" w:hAnsi="Calibri"/>
-                <w:sz w:val="20"/>
-              </w:rPr>
-              <w:t xml:space="default">-11</w:t>
-            </w:r>
-          </w:p>
-        </w:tc>
-        <w:tc>
-          <w:tcPr>
-            <w:tcBorders>
-              <w:top w:val="single" w:space="0" w:color="D3D3D3"/>
-              <w:bottom w:val="single" w:space="0" w:color="D3D3D3"/>
-              <w:start w:val="single" w:space="0" w:color="D3D3D3"/>
-              <w:end w:val="single" w:space="0" w:color="D3D3D3"/>
-            </w:tcBorders>
-          </w:tcPr>
-          <w:p>
-            <w:pPr>
-              <w:spacing w:before="0" w:after="60"/>
-              <w:keepNext/>
-              <w:jc w:val="center"/>
-            </w:pPr>
-            <w:r>
-              <w:rPr>
-                <w:rFonts w:ascii="Calibri" w:hAnsi="Calibri"/>
-                <w:sz w:val="20"/>
-              </w:rPr>
-              <w:t xml:space="default">-13, -9.0</w:t>
-            </w:r>
-          </w:p>
-        </w:tc>
-        <w:tc>
-          <w:tcPr>
-            <w:tcBorders>
-              <w:top w:val="single" w:space="0" w:color="D3D3D3"/>
-              <w:bottom w:val="single" w:space="0" w:color="D3D3D3"/>
-              <w:start w:val="single" w:space="0" w:color="D3D3D3"/>
-              <w:end w:val="single" w:space="0" w:color="D3D3D3"/>
-            </w:tcBorders>
-          </w:tcPr>
-          <w:p>
-            <w:pPr>
-              <w:spacing w:before="0" w:after="60"/>
-              <w:keepNext/>
-              <w:jc w:val="center"/>
-            </w:pPr>
-            <w:r>
-              <w:rPr>
-                <w:rFonts w:ascii="Calibri" w:hAnsi="Calibri"/>
-                <w:sz w:val="20"/>
-              </w:rPr>
-              <w:t xml:space="default">&lt;0.001</w:t>
-            </w:r>
-          </w:p>
-        </w:tc>
-      </w:tr>
-      <w:tr>
-        <w:trPr>
-          <w:cantSplit/>
-        </w:trPr>
-        <w:tc>
-          <w:tcPr>
             <w:gridSpan w:val="4"/>
           </w:tcPr>
           <w:p>
@@ -1851,7 +1761,7 @@
         <w:pStyle w:val="FirstParagraph"/>
       </w:pPr>
       <w:r>
-        <w:t xml:space="preserve">healthcare_expenses ~ age + gender + n_encounters + age*n_encounters</w:t>
+        <w:t xml:space="preserve">log(1 + healthcare_expenses) ~ age + gender + n_encounters</w:t>
       </w:r>
     </w:p>
     <w:p>
@@ -1889,17 +1799,6 @@
     </w:p>
     <w:p>
       <w:pPr>
-        <w:numPr>
-          <w:ilvl w:val="0"/>
-          <w:numId w:val="1005"/>
-        </w:numPr>
-      </w:pPr>
-      <w:r>
-        <w:t xml:space="preserve">Interaction term barely affects slope</w:t>
-      </w:r>
-    </w:p>
-    <w:p>
-      <w:pPr>
         <w:pStyle w:val="FirstParagraph"/>
       </w:pPr>
       <w:r>
@@ -1913,6 +1812,9 @@
         <w:pStyle w:val="Heading2"/>
       </w:pPr>
       <w:r>
+        <w:rPr>
+          <w:rStyle w:val="VerbatimChar"/>
+        </w:rPr>
         <w:t xml:space="preserve">Thank you! 💖</w:t>
       </w:r>
     </w:p>

</xml_diff>